<commit_message>
feat: add GitHub Actions Windows CI/CD, Visual Template Studio, and Master Signature Explorer
</commit_message>
<xml_diff>
--- a/samples/TEMPLATE_RAPORT_TK_FULL.docx
+++ b/samples/TEMPLATE_RAPORT_TK_FULL.docx
@@ -27395,6 +27395,9 @@
                 <w:lang w:val="sv-SE" w:eastAsia="zh-CN"/>
               </w:rPr>
             </w:pPr>
+            <w:r>
+              <w:t>{{ ttd_kepsek }}</w:t>
+            </w:r>
           </w:p>
           <w:p>
             <w:pPr>
@@ -27602,6 +27605,9 @@
                 <w:lang w:val="en-US"/>
               </w:rPr>
             </w:pPr>
+            <w:r>
+              <w:t>{{ ttd_guru }}</w:t>
+            </w:r>
           </w:p>
           <w:p>
             <w:pPr>

</xml_diff>